<commit_message>
content(cv): añadir la experiencia de Gsamples-Global (Chile) al bloque paralelo
API REST prototipo de un sistema de trazabilidad de muestras geológicas
mineras, 08/2023 - 07/2024, en Laravel, MySQL, Docker y Traefik sobre un VPS.
Entra en la web ES y EN, en los cuatro documentos ATS y sube a "cuatro" la
nota del bloque de compromisos simultáneos, que ahora llegan hasta 2024.

Los dominios del proyecto no se enlazan porque ya no resuelven en DNS.

Co-Authored-By: Claude Fable 5.1 <noreply@anthropic.com>
Claude-Session: https://claude.ai/code/session_013KDeMS5SHWGQdfTxqrRYCk
</commit_message>
<xml_diff>
--- a/src/documentos/Jose-Hernan-Varela-Backend-Developer-EN.docx
+++ b/src/documentos/Jose-Hernan-Varela-Backend-Developer-EN.docx
@@ -166,7 +166,66 @@
       </w:pPr>
       <w:r>
         <w:rPr/>
-        <w:t xml:space="preserve">The three engagements below ran concurrently with the IT Manager role, not as consecutive positions.</w:t>
+        <w:t xml:space="preserve">The four engagements below ran concurrently with the IT Manager role, not as consecutive positions.</w:t>
+      </w:r>
+    </w:p>
+    <w:p>
+      <w:pPr>
+        <w:spacing w:before="120" w:after="40"/>
+      </w:pPr>
+      <w:r>
+        <w:rPr>
+          <w:b/>
+        </w:rPr>
+        <w:t xml:space="preserve">Backend Developer - Gsamples-Global (Chile)</w:t>
+      </w:r>
+    </w:p>
+    <w:p>
+      <w:pPr>
+        <w:spacing w:before="0" w:after="40"/>
+      </w:pPr>
+      <w:r>
+        <w:rPr/>
+        <w:t xml:space="preserve">Aug 2023 – Jul 2024 | Freelance, alongside PCVARELAVENEZUELA</w:t>
+      </w:r>
+    </w:p>
+    <w:p>
+      <w:pPr>
+        <w:spacing w:before="0" w:after="40"/>
+        <w:ind w:left="284"/>
+      </w:pPr>
+      <w:r>
+        <w:rPr/>
+        <w:t xml:space="preserve">- Prototype of the REST API for a mining geological sample traceability system.</w:t>
+      </w:r>
+    </w:p>
+    <w:p>
+      <w:pPr>
+        <w:spacing w:before="0" w:after="40"/>
+        <w:ind w:left="284"/>
+      </w:pPr>
+      <w:r>
+        <w:rPr/>
+        <w:t xml:space="preserve">- Modelled the life cycle of a drill core sample, from the field to storage and laboratory analysis.</w:t>
+      </w:r>
+    </w:p>
+    <w:p>
+      <w:pPr>
+        <w:spacing w:before="0" w:after="40"/>
+        <w:ind w:left="284"/>
+      </w:pPr>
+      <w:r>
+        <w:rPr/>
+        <w:t xml:space="preserve">- Deployment on a Contabo VPS with Docker and Traefik.</w:t>
+      </w:r>
+    </w:p>
+    <w:p>
+      <w:pPr>
+        <w:spacing w:before="0" w:after="40"/>
+      </w:pPr>
+      <w:r>
+        <w:rPr/>
+        <w:t xml:space="preserve">Technologies: PHP, Laravel, MySQL, Docker, Traefik</w:t>
       </w:r>
     </w:p>
     <w:p>

</xml_diff>

<commit_message>
content(cv): añadir la plataforma MLS inmobiliaria como producto propio en producción
Sexta entrada del bloque paralelo, 08/2025 - Presente: API REST multi-inquilino
en Node.js 22, Express 5 y PostgreSQL con Prisma. Las cifras (353 endpoints,
57 routers, 53 modelos, 75 migraciones, 2.154 tests, 163 suites, 18 tests de
seguridad) se contaron sobre el repositorio y viven en METRICAS con el comando
que las produce. Se dejaron fuera las del dossier que no salen de una medición.

El subtítulo de la sección pasa a "desde 2019", la nota ATS a "cinco
compromisos", y Stack y Habilidades incorporan Express 5 y Prisma.

Co-Authored-By: Claude Fable 5.1 <noreply@anthropic.com>
Claude-Session: https://claude.ai/code/session_013KDeMS5SHWGQdfTxqrRYCk
</commit_message>
<xml_diff>
--- a/src/documentos/Jose-Hernan-Varela-Backend-Developer-EN.docx
+++ b/src/documentos/Jose-Hernan-Varela-Backend-Developer-EN.docx
@@ -166,7 +166,96 @@
       </w:pPr>
       <w:r>
         <w:rPr/>
-        <w:t xml:space="preserve">The four engagements below ran concurrently with the IT Manager role, not as consecutive positions.</w:t>
+        <w:t xml:space="preserve">The five engagements below ran concurrently with the IT Manager role, not as consecutive positions.</w:t>
+      </w:r>
+    </w:p>
+    <w:p>
+      <w:pPr>
+        <w:spacing w:before="120" w:after="40"/>
+      </w:pPr>
+      <w:r>
+        <w:rPr>
+          <w:b/>
+        </w:rPr>
+        <w:t xml:space="preserve">Backend Developer - Real estate MLS platform (own product in production)</w:t>
+      </w:r>
+    </w:p>
+    <w:p>
+      <w:pPr>
+        <w:spacing w:before="0" w:after="40"/>
+      </w:pPr>
+      <w:r>
+        <w:rPr/>
+        <w:t xml:space="preserve">Aug 2025 – Present | Own product, alongside PCVARELAVENEZUELA</w:t>
+      </w:r>
+    </w:p>
+    <w:p>
+      <w:pPr>
+        <w:spacing w:before="0" w:after="40"/>
+        <w:ind w:left="284"/>
+      </w:pPr>
+      <w:r>
+        <w:rPr/>
+        <w:t xml:space="preserve">- Multi-tenant REST API on Node.js 22, Express 5 and PostgreSQL with Prisma: 353 endpoints across 57 routers, 53 models and 75 incremental migrations, deployed behind Traefik in a distroless, shell-less, non-root Docker image.</w:t>
+      </w:r>
+    </w:p>
+    <w:p>
+      <w:pPr>
+        <w:spacing w:before="0" w:after="40"/>
+        <w:ind w:left="284"/>
+      </w:pPr>
+      <w:r>
+        <w:rPr/>
+        <w:t xml:space="preserve">- Multi-tenant authorisation with database-backed RBAC and company- and agent-level scope derived from the JWT; cross-tenant leaks were closed as a class (whitelisted projections, output DTOs and generic 404s) and are pinned by 18 security tests.</w:t>
+      </w:r>
+    </w:p>
+    <w:p>
+      <w:pPr>
+        <w:spacing w:before="0" w:after="40"/>
+        <w:ind w:left="284"/>
+      </w:pPr>
+      <w:r>
+        <w:rPr/>
+        <w:t xml:space="preserve">- Two payment gateways in parallel (Stripe and PayU) with raw-body webhooks, recurring subscriptions and header-based idempotency on mutating operations.</w:t>
+      </w:r>
+    </w:p>
+    <w:p>
+      <w:pPr>
+        <w:spacing w:before="0" w:after="40"/>
+        <w:ind w:left="284"/>
+      </w:pPr>
+      <w:r>
+        <w:rPr/>
+        <w:t xml:space="preserve">- Redis cache with ETag/304, TTL by data type and targeted invalidation on every write; three-layer rate limiting (Traefik per IP, a global ceiling and per-route limiters backed by Redis).</w:t>
+      </w:r>
+    </w:p>
+    <w:p>
+      <w:pPr>
+        <w:spacing w:before="0" w:after="40"/>
+        <w:ind w:left="284"/>
+      </w:pPr>
+      <w:r>
+        <w:rPr/>
+        <w:t xml:space="preserve">- Full identity lifecycle: JWT with blacklist, global session revocation on password change, OTP-based 2FA and Google Sign-In with ID token verification against JWKS.</w:t>
+      </w:r>
+    </w:p>
+    <w:p>
+      <w:pPr>
+        <w:spacing w:before="0" w:after="40"/>
+        <w:ind w:left="284"/>
+      </w:pPr>
+      <w:r>
+        <w:rPr/>
+        <w:t xml:space="preserve">- Suite of 2,154 tests (Jest and Supertest, 163 suites), including guardrail tests that fail if an eliminated architectural pattern reappears.</w:t>
+      </w:r>
+    </w:p>
+    <w:p>
+      <w:pPr>
+        <w:spacing w:before="0" w:after="40"/>
+      </w:pPr>
+      <w:r>
+        <w:rPr/>
+        <w:t xml:space="preserve">Technologies: Node.js, Express 5, PostgreSQL, Prisma, Redis, Socket.IO, Docker, Traefik, Stripe, PayU, Jest</w:t>
       </w:r>
     </w:p>
     <w:p>
@@ -454,16 +543,16 @@
       </w:pPr>
       <w:r>
         <w:rPr/>
-        <w:t xml:space="preserve">Languages: Python, JavaScript (ES6+), PHP, SQL / PL-pgSQL</w:t>
-      </w:r>
-    </w:p>
-    <w:p>
-      <w:pPr>
-        <w:spacing w:before="0" w:after="40"/>
-      </w:pPr>
-      <w:r>
-        <w:rPr/>
-        <w:t xml:space="preserve">Backend frameworks: Django, Django REST Framework, FastAPI, Laravel, Lumen, Express.js</w:t>
+        <w:t xml:space="preserve">Languages: Python, JavaScript (Node.js, ES6+), PHP, SQL / PL-pgSQL</w:t>
+      </w:r>
+    </w:p>
+    <w:p>
+      <w:pPr>
+        <w:spacing w:before="0" w:after="40"/>
+      </w:pPr>
+      <w:r>
+        <w:rPr/>
+        <w:t xml:space="preserve">Backend frameworks: Django, Django REST Framework, FastAPI, Express 5, Prisma, Laravel, Lumen</w:t>
       </w:r>
     </w:p>
     <w:p>

</xml_diff>